<commit_message>
Rewrite final report in a more natural academic voice
</commit_message>
<xml_diff>
--- a/outputs/buss425/report/buss425_final_report.docx
+++ b/outputs/buss425/report/buss425_final_report.docx
@@ -2,18 +2,11 @@
 <file path=word/document.xml><?xml version="1.0" encoding="utf-8"?>
 <w:document xmlns:w="http://schemas.openxmlformats.org/wordprocessingml/2006/main" xmlns:m="http://schemas.openxmlformats.org/officeDocument/2006/math" xmlns:r="http://schemas.openxmlformats.org/officeDocument/2006/relationships" xmlns:o="urn:schemas-microsoft-com:office:office" xmlns:v="urn:schemas-microsoft-com:vml" xmlns:w10="urn:schemas-microsoft-com:office:word" xmlns:a="http://schemas.openxmlformats.org/drawingml/2006/main" xmlns:pic="http://schemas.openxmlformats.org/drawingml/2006/picture" xmlns:wp="http://schemas.openxmlformats.org/drawingml/2006/wordprocessingDrawing">
   <w:body>
-    <w:p>
-      <w:pPr>
-        <w:pStyle w:val="Title"/>
-      </w:pPr>
-      <w:r>
-        <w:t xml:space="preserve">Email Co-presence Network Centrality in the Epstein Email Archive</w:t>
-      </w:r>
-    </w:p>
     <w:bookmarkStart w:id="9" w:name="X1e0282f838ff0a3a4fee79dca3435153e8a7b53"/>
     <w:p>
       <w:pPr>
         <w:pStyle w:val="Heading1"/>
+        <w:keepNext/>
       </w:pPr>
       <w:r>
         <w:t xml:space="preserve">Email Co-presence Network Centrality in the Epstein Email Archive</w:t>
@@ -116,12 +109,16 @@
       <w:r>
         <w:t xml:space="preserve">3D network graph</w:t>
       </w:r>
+      <w:r>
+        <w:br w:type="page"/>
+      </w:r>
     </w:p>
     <w:bookmarkEnd w:id="9"/>
     <w:bookmarkStart w:id="10" w:name="table-of-contents"/>
     <w:p>
       <w:pPr>
         <w:pStyle w:val="Heading1"/>
+        <w:keepNext/>
       </w:pPr>
       <w:r>
         <w:t xml:space="preserve">Table of Contents</w:t>
@@ -241,6 +238,9 @@
       </w:r>
       <w:r>
         <w:t xml:space="preserve">References</w:t>
+      </w:r>
+      <w:r>
+        <w:br w:type="page"/>
       </w:r>
     </w:p>
     <w:bookmarkEnd w:id="10"/>
@@ -248,6 +248,7 @@
     <w:p>
       <w:pPr>
         <w:pStyle w:val="Heading1"/>
+        <w:keepNext/>
       </w:pPr>
       <w:r>
         <w:t xml:space="preserve">Abstract</w:t>
@@ -258,7 +259,7 @@
         <w:pStyle w:val="FirstParagraph"/>
       </w:pPr>
       <w:r>
-        <w:t xml:space="preserve">This research analyzes the released Epstein email archive as an informal co-presence network. The purpose is to answer a network-centrality question:</w:t>
+        <w:t xml:space="preserve">This report examines the released Epstein email archive as an informal co-presence network. It asks:</w:t>
       </w:r>
       <w:r>
         <w:t xml:space="preserve"> </w:t>
@@ -268,13 +269,13 @@
           <w:b/>
           <w:bCs/>
         </w:rPr>
-        <w:t xml:space="preserve">which actors are structurally central in the Epstein email co-presence network, and what does centrality reveal beyond the expected dominance of Jeffrey Epstein?</w:t>
+        <w:t xml:space="preserve">which actors occupy central positions in the email metadata, and what can be learned once Jeffrey Epstein’s expected dominance is set aside?</w:t>
       </w:r>
       <w:r>
         <w:t xml:space="preserve"> </w:t>
       </w:r>
       <w:r>
-        <w:t xml:space="preserve">The final filtered network contains 1,224 visible actors and 5,426 weighted co-presence edges after excluding unknown and redacted actor labels. An edge is created when two actors appear in the same email metadata record, such as sender, recipient, cc, or bcc, and edge weight counts repeated co-presence across retained records. This design accounts for relationship strength rather than only relationship presence.</w:t>
+        <w:t xml:space="preserve">After unknown and redacted labels are removed, the network contains 1,224 visible actors and 5,426 weighted edges. Two actors are linked when they appear in the same retained email metadata record, whether as sender, recipient, cc, or bcc. The weight of an edge is the number of retained records in which the pair appears together.</w:t>
       </w:r>
     </w:p>
     <w:p>
@@ -282,7 +283,7 @@
         <w:pStyle w:val="BodyText"/>
       </w:pPr>
       <w:r>
-        <w:t xml:space="preserve">The analysis uses degree, weighted degree, and betweenness centrality to identify different kinds of structural importance. Jeffrey Epstein is the highest-ranked actor by all three measures, with degree 730, weighted degree 343,926, and betweenness 0.904. This result is important but partly expected because the archive boundary is Epstein-centered. The more informative finding is the second layer of central actors. Lesley Groff, Richard Kahn, Stewart Oldfield, Brad Edwards, Karyna Shuliak, Ghislaine Maxwell, Paul Morris, Daphne Wallace, and Noam Chomsky become visible through different combinations of reach, repeated co-presence, and brokerage. The research therefore shows that the visible email metadata is not only centered around Epstein, but also structured through a small set of intermediaries who connect administrative, financial, operational, legal, and social parts of the archive.</w:t>
+        <w:t xml:space="preserve">Three measures are used: degree, weighted degree, and betweenness centrality. Epstein ranks first on all three, with degree 730, weighted degree 343,926, and betweenness 0.904. Because the archive is centered on his correspondence, this is a useful baseline rather than an unexpected result. The more informative part of the analysis is the group immediately below him. Lesley Groff and Richard Kahn stand out through both reach and repeated co-presence. Stewart Oldfield, Brad Edwards, Karyna Shuliak, Ghislaine Maxwell, Paul Morris, Daphne Wallace, and Noam Chomsky appear through different combinations of volume and brokerage.</w:t>
       </w:r>
     </w:p>
     <w:p>
@@ -290,7 +291,7 @@
         <w:pStyle w:val="BodyText"/>
       </w:pPr>
       <w:r>
-        <w:t xml:space="preserve">The interpretation is intentionally cautious. A co-presence edge does not prove direct communication, friendship, collaboration, shared intent, responsibility, or wrongdoing. It only records that two actors appeared in the same released email metadata. The research therefore treats centrality as evidence about structure inside the released archive, not as a complete reconstruction of the broader real-world Epstein network.</w:t>
+        <w:t xml:space="preserve">These findings need to be read narrowly. A co-presence edge is not proof that two people communicated directly, had a close relationship, collaborated, shared intent, or committed wrongdoing. It records an association inside the released email metadata. The network is useful for studying the structure of that archive, not for reconstructing the full real-world network around Epstein.</w:t>
       </w:r>
     </w:p>
     <w:bookmarkEnd w:id="11"/>
@@ -298,6 +299,7 @@
     <w:p>
       <w:pPr>
         <w:pStyle w:val="Heading1"/>
+        <w:keepNext/>
       </w:pPr>
       <w:r>
         <w:t xml:space="preserve">1. Introduction</w:t>
@@ -308,7 +310,7 @@
         <w:pStyle w:val="FirstParagraph"/>
       </w:pPr>
       <w:r>
-        <w:t xml:space="preserve">Social network analysis is useful when the main question is not only about who the actors are, but about how those actors are positioned in a system of relationships. In organizational and informal networks, outcomes can depend heavily on structure: who is connected to many others, who appears repeatedly in important flows, who bridges otherwise separate groups, and who becomes a dependency point for coordination. This research asks a problem where network analysis, and specifically centrality analysis, can help produce a better answer. The Epstein email archive provides a suitable case because the archive is large, relational, and organized through repeated communication metadata.</w:t>
+        <w:t xml:space="preserve">The released Epstein email archive contains more than message text. Its metadata records who appeared as sender, recipient, cc, or bcc across a large set of emails. Once those appearances are linked at the actor level, the archive can be studied as a network. This makes it possible to ask which names are broadly connected, which pairs recur most often, and which actors sit between otherwise less connected areas of the graph.</w:t>
       </w:r>
     </w:p>
     <w:p>
@@ -336,7 +338,7 @@
         <w:pStyle w:val="FirstParagraph"/>
       </w:pPr>
       <w:r>
-        <w:t xml:space="preserve">This question is deliberately phrased in two parts. The first part asks who is central. The second part asks what can be learned after acknowledging an obvious expectation: since the archive is centered around Epstein, it is not surprising if Epstein appears as the dominant node. If the analysis stopped there, it would add little. The stronger contribution is to ask which other actors are structurally important, what kinds of centrality they have, and whether they appear as high-volume participants, repeated co-presence actors, or brokers between different parts of the graph.</w:t>
+        <w:t xml:space="preserve">The second part matters. Epstein is the focal actor of the archive, so a ranking that simply places him first would not tell us much. The useful question is what happens below that obvious center. Some actors may appear with many different people. Others may recur frequently with a smaller set of names. A third group may be visible because their positions connect sections of the network that would otherwise be more distant from one another.</w:t>
       </w:r>
     </w:p>
     <w:p>
@@ -344,7 +346,7 @@
         <w:pStyle w:val="BodyText"/>
       </w:pPr>
       <w:r>
-        <w:t xml:space="preserve">Email archives are often administrative residue. They contain routine messages about meetings, travel, payments, introductions, reminders, documents, legal communication, and social coordination. Precisely because these records are ordinary, they can reveal structures that are not visible from public narratives alone. Previous research on email archives, especially the Enron corpus, shows that email data can be studied not only as text but also as organizational communication data (Klimt &amp; Yang, 2004; Diesner et al., 2005). Network analysis is particularly relevant because email metadata can be transformed into actor-level networks.</w:t>
+        <w:t xml:space="preserve">Email archives are a practical source for this type of analysis because they preserve routine traces of coordination: scheduling, travel, payments, introductions, reminders, documents, legal correspondence, and social arrangements. Studies of the Enron corpus have shown that email records can be used as relational data as well as text (Klimt &amp; Yang, 2004; Diesner et al., 2005). The same general approach is useful here, although this archive raises a particularly important interpretive issue.</w:t>
       </w:r>
     </w:p>
     <w:p>
@@ -352,7 +354,7 @@
         <w:pStyle w:val="BodyText"/>
       </w:pPr>
       <w:r>
-        <w:t xml:space="preserve">At the same time, this research requires special caution. The network constructed here is a</w:t>
+        <w:t xml:space="preserve">The graph in this report is a</w:t>
       </w:r>
       <w:r>
         <w:t xml:space="preserve"> </w:t>
@@ -365,7 +367,7 @@
         <w:t xml:space="preserve">co-presence network</w:t>
       </w:r>
       <w:r>
-        <w:t xml:space="preserve">. An edge means that two actors appeared in the same email metadata record, such as sender, recipient, cc, or bcc. It does not necessarily mean that the two actors directly communicated with each other. It does not prove a close relationship, collaboration, shared intent, responsibility, or wrongdoing. This distinction is central to the entire analysis because the topic is sensitive and because network diagrams can easily be overread. The goal is to describe structural patterns in the released archive, not to infer guilt or reconstruct the complete real-world network.</w:t>
+        <w:t xml:space="preserve">. An edge means that two actors appeared in the same email metadata record. It does not automatically mean that one person sent a message to the other. It also does not establish friendship, collaboration, responsibility, shared intent, or wrongdoing. Distribution lists, copied recipients, administrative threads, and forwarded messages can all place names together in metadata. This limitation is repeated throughout the report because network diagrams can make a weak association look more definite than it is.</w:t>
       </w:r>
     </w:p>
     <w:p>
@@ -373,7 +375,7 @@
         <w:pStyle w:val="BodyText"/>
       </w:pPr>
       <w:r>
-        <w:t xml:space="preserve">The research contributes in three ways. First, it constructs a bounded informal network with more than the required minimum of ten actors. Second, it uses weighted ties, meaning that the analysis accounts for the strength of repeated co-presence rather than only the presence or absence of a tie. Third, it applies multiple centrality measures to distinguish different kinds of structural importance. Degree centrality captures broad reach, weighted degree captures repeated co-presence intensity, and betweenness centrality captures brokerage between parts of the graph.</w:t>
+        <w:t xml:space="preserve">The analysis has three main parts. First, it constructs an undirected weighted network from the retained metadata. Second, it compares degree, weighted degree, and betweenness centrality. Third, it checks whether the main pattern remains visible under stricter edge thresholds and in a directed sender-recipient version of the graph.</w:t>
       </w:r>
     </w:p>
     <w:bookmarkEnd w:id="12"/>
@@ -381,6 +383,7 @@
     <w:p>
       <w:pPr>
         <w:pStyle w:val="Heading1"/>
+        <w:keepNext/>
       </w:pPr>
       <w:r>
         <w:t xml:space="preserve">2. Data and Network Construction</w:t>
@@ -391,7 +394,7 @@
         <w:pStyle w:val="FirstParagraph"/>
       </w:pPr>
       <w:r>
-        <w:t xml:space="preserve">The network boundary is the released Epstein email archive used in the project. The network does not attempt to represent every person connected to Epstein in the real world. It represents only actors who appear in the available email metadata after filtering. This boundary is important because centrality is always relative to the network being analyzed. A person who is central in the released email archive is not necessarily central in every possible Epstein-related network.</w:t>
+        <w:t xml:space="preserve">The boundary of the network is the released Epstein email archive used in the project. It is not a list of every person associated with Epstein in any setting. It includes only actors who appear in the available metadata after filtering. Centrality is therefore relative to this archive. A person who is prominent in these records may not have the same position in a network built from a different source.</w:t>
       </w:r>
     </w:p>
     <w:p>
@@ -399,7 +402,7 @@
         <w:pStyle w:val="BodyText"/>
       </w:pPr>
       <w:r>
-        <w:t xml:space="preserve">The research uses three linked data tables produced from the local analysis pipeline. The first table,</w:t>
+        <w:t xml:space="preserve">The local pipeline uses three linked tables.</w:t>
       </w:r>
       <w:r>
         <w:t xml:space="preserve"> </w:t>
@@ -411,7 +414,10 @@
         <w:t xml:space="preserve">fact_emails.parquet</w:t>
       </w:r>
       <w:r>
-        <w:t xml:space="preserve">, stores email-level information, including cleaned text and metadata. The second table,</w:t>
+        <w:t xml:space="preserve"> </w:t>
+      </w:r>
+      <w:r>
+        <w:t xml:space="preserve">contains email-level fields, including cleaned text and metadata.</w:t>
       </w:r>
       <w:r>
         <w:t xml:space="preserve"> </w:t>
@@ -423,7 +429,10 @@
         <w:t xml:space="preserve">bridge_email_people.parquet</w:t>
       </w:r>
       <w:r>
-        <w:t xml:space="preserve">, links emails to actors appearing in sender, recipient, cc, or bcc fields. The third table,</w:t>
+        <w:t xml:space="preserve"> </w:t>
+      </w:r>
+      <w:r>
+        <w:t xml:space="preserve">links each email to the people appearing in sender, recipient, cc, or bcc fields.</w:t>
       </w:r>
       <w:r>
         <w:t xml:space="preserve"> </w:t>
@@ -435,7 +444,10 @@
         <w:t xml:space="preserve">dim_people.parquet</w:t>
       </w:r>
       <w:r>
-        <w:t xml:space="preserve">, stores canonical person identifiers and display names. The unit of analysis for the network is the person-email participation link.</w:t>
+        <w:t xml:space="preserve"> </w:t>
+      </w:r>
+      <w:r>
+        <w:t xml:space="preserve">stores canonical identifiers and display names. The network is built from the person-email participation links.</w:t>
       </w:r>
     </w:p>
     <w:p>
@@ -443,7 +455,7 @@
         <w:pStyle w:val="BodyText"/>
       </w:pPr>
       <w:r>
-        <w:t xml:space="preserve">The raw email table contains 1,758,382 rows. The broader project filters very short rows, visibly redacted senders, and likely non-English rows for text-mining purposes. For the network, the main actor-level filter removes unknown and redacted actor labels so that placeholder identities do not dominate the centrality ranking. This improves interpretability, but it also means that the final network describes the visible released metadata rather than the complete underlying communication environment.</w:t>
+        <w:t xml:space="preserve">The raw email table contains 1,758,382 rows. The broader project applies text-oriented cleaning rules, including filters for very short rows, visibly redacted senders, and likely non-English content. The network stage has an additional actor-level filter: unknown and redacted labels are removed so that placeholders do not dominate the rankings. This produces a more readable graph, but it also means that the results describe visible identities in the released metadata rather than the full underlying communication environment.</w:t>
       </w:r>
     </w:p>
     <w:p>
@@ -451,7 +463,7 @@
         <w:pStyle w:val="BodyText"/>
       </w:pPr>
       <w:r>
-        <w:t xml:space="preserve">The final filtered co-presence network has the following structure:</w:t>
+        <w:t xml:space="preserve">The final filtered network has the following structure:</w:t>
       </w:r>
     </w:p>
     <w:tbl>
@@ -947,7 +959,7 @@
         <w:pStyle w:val="BodyText"/>
       </w:pPr>
       <w:r>
-        <w:t xml:space="preserve">The crowded-email cutoff is used because very large email records can behave like distribution lists. If an email contains many actors, connecting every actor to every other actor may create artificial density. The cutoff therefore reduces the risk that bulk messages dominate the network structure. The minimum edge threshold of two repeated co-presences is also important. It removes one-off metadata associations and focuses the analysis on repeated appearances.</w:t>
+        <w:t xml:space="preserve">Two filtering choices deserve explanation. First, records with more than 25 actors are skipped. A large distribution list can create many pairwise links from a single email and make the graph artificially dense. Second, a pair must appear together at least twice before an edge is retained. This removes one-off associations and keeps the analysis focused on repeated co-presence.</w:t>
       </w:r>
     </w:p>
     <w:p>
@@ -955,7 +967,7 @@
         <w:pStyle w:val="BodyText"/>
       </w:pPr>
       <w:r>
-        <w:t xml:space="preserve">The edge weight is the main way the analysis accounts for relationship strength. For example, if two actors appear together in 50 retained email metadata records, their edge has weight 50. This does not mean that they communicated directly 50 times; it means that the released metadata places them together 50 times. The wording matters because the network is a representation of metadata co-presence, not verified social closeness.</w:t>
+        <w:t xml:space="preserve">The edge weight is straightforward: if two people appear together in 50 retained metadata records, the edge between them has weight 50. That value should not be described as 50 direct messages or as a measure of personal closeness. It is a count of repeated metadata co-presence.</w:t>
       </w:r>
     </w:p>
     <w:bookmarkEnd w:id="13"/>
@@ -963,6 +975,7 @@
     <w:p>
       <w:pPr>
         <w:pStyle w:val="Heading1"/>
+        <w:keepNext/>
       </w:pPr>
       <w:r>
         <w:t xml:space="preserve">3. Methods</w:t>
@@ -973,200 +986,144 @@
         <w:pStyle w:val="FirstParagraph"/>
       </w:pPr>
       <w:r>
-        <w:t xml:space="preserve">Before presenting the results, it is necessary to define the main network terms. A</w:t>
-      </w:r>
-      <w:r>
-        <w:t xml:space="preserve"> </w:t>
-      </w:r>
+        <w:t xml:space="preserve">The graph uses actors as nodes and repeated metadata co-presences as weighted edges. The analysis focuses on three familiar ideas from social network analysis: reach, repeated association, and brokerage. They are related, but they are not interchangeable. A person can appear with many different actors without sitting between clusters. Another person can have fewer ties but occupy a position that links sections of the network.</w:t>
+      </w:r>
+    </w:p>
+    <w:bookmarkStart w:id="14" w:name="network-definition-and-adjacency-matrix"/>
+    <w:p>
+      <w:pPr>
+        <w:pStyle w:val="Heading2"/>
+        <w:keepNext/>
+      </w:pPr>
+      <w:r>
+        <w:t xml:space="preserve">3.1 Network Definition and Adjacency Matrix</w:t>
+      </w:r>
+    </w:p>
+    <w:p>
+      <w:pPr>
+        <w:pStyle w:val="FirstParagraph"/>
+      </w:pPr>
+      <w:r>
+        <w:t xml:space="preserve">The main graph is undirected and weighted. It is undirected because the edge rule does not distinguish between sender and recipient roles. Two actors are connected if they share a retained metadata record, regardless of whether one sent the email to the other or whether both names appeared in recipient fields. This gives a broad view of shared participation in the archive. It does not claim that every connected pair exchanged messages directly.</w:t>
+      </w:r>
+    </w:p>
+    <w:p>
+      <w:pPr>
+        <w:pStyle w:val="BodyText"/>
+      </w:pPr>
+      <w:r>
+        <w:t xml:space="preserve">The adjacency matrix records the graph in tabular form. Rows and columns represent actors, and each cell contains the weight of the edge between a pair. A zero means that no retained repeated co-presence edge exists. Because the graph is undirected, the matrix is symmetric. The diagonal is zero because self-links are excluded.</w:t>
+      </w:r>
+    </w:p>
+    <w:p>
+      <w:pPr>
+        <w:pStyle w:val="BodyText"/>
+      </w:pPr>
+      <w:r>
+        <w:t xml:space="preserve">The complete weighted adjacency matrix is stored at:</w:t>
+      </w:r>
+    </w:p>
+    <w:p>
+      <w:pPr>
+        <w:pStyle w:val="BodyText"/>
+      </w:pPr>
+      <w:r>
+        <w:rPr>
+          <w:rStyle w:val="VerbatimChar"/>
+        </w:rPr>
+        <w:t xml:space="preserve">outputs/buss425/full_weighted_adjacency_matrix.csv</w:t>
+      </w:r>
+    </w:p>
+    <w:p>
+      <w:pPr>
+        <w:pStyle w:val="BodyText"/>
+      </w:pPr>
+      <w:r>
+        <w:t xml:space="preserve">At 1,224 by 1,224 cells, the full matrix is too large to reproduce meaningfully on a printed page. A top-15 excerpt is included for presentation:</w:t>
+      </w:r>
+    </w:p>
+    <w:p>
+      <w:pPr>
+        <w:pStyle w:val="BodyText"/>
+      </w:pPr>
+      <w:r>
+        <w:rPr>
+          <w:rStyle w:val="VerbatimChar"/>
+        </w:rPr>
+        <w:t xml:space="preserve">docs/buss425_top15_adjacency_matrix.md</w:t>
+      </w:r>
+    </w:p>
+    <w:p>
+      <w:pPr>
+        <w:pStyle w:val="BodyText"/>
+      </w:pPr>
+      <w:r>
+        <w:t xml:space="preserve">The smaller matrix is a readable extract. The CSV remains the complete analytical output.</w:t>
+      </w:r>
+    </w:p>
+    <w:bookmarkEnd w:id="14"/>
+    <w:bookmarkStart w:id="15" w:name="centrality-measures"/>
+    <w:p>
+      <w:pPr>
+        <w:pStyle w:val="Heading2"/>
+        <w:keepNext/>
+      </w:pPr>
+      <w:r>
+        <w:t xml:space="preserve">3.2 Centrality Measures</w:t>
+      </w:r>
+    </w:p>
+    <w:p>
+      <w:pPr>
+        <w:pStyle w:val="FirstParagraph"/>
+      </w:pPr>
       <w:r>
         <w:rPr>
           <w:b/>
           <w:bCs/>
         </w:rPr>
-        <w:t xml:space="preserve">node</w:t>
+        <w:t xml:space="preserve">Degree centrality</w:t>
       </w:r>
       <w:r>
         <w:t xml:space="preserve"> </w:t>
       </w:r>
       <w:r>
-        <w:t xml:space="preserve">is an actor in the network. An</w:t>
-      </w:r>
-      <w:r>
-        <w:t xml:space="preserve"> </w:t>
-      </w:r>
+        <w:t xml:space="preserve">counts the number of distinct actors connected to a node. Here, it measures the breadth of an actor’s co-presence links. A high-degree actor appears in retained metadata records with many different people.</w:t>
+      </w:r>
+    </w:p>
+    <w:p>
+      <w:pPr>
+        <w:pStyle w:val="BodyText"/>
+      </w:pPr>
       <w:r>
         <w:rPr>
           <w:b/>
           <w:bCs/>
         </w:rPr>
-        <w:t xml:space="preserve">edge</w:t>
+        <w:t xml:space="preserve">Weighted degree</w:t>
       </w:r>
       <w:r>
         <w:t xml:space="preserve"> </w:t>
       </w:r>
       <w:r>
-        <w:t xml:space="preserve">is a connection between two actors. In this research, an edge means co-presence in the same email metadata record. A</w:t>
-      </w:r>
-      <w:r>
-        <w:t xml:space="preserve"> </w:t>
-      </w:r>
+        <w:t xml:space="preserve">adds the weights of a node’s edges. It captures repeated co-presence rather than treating every link as equal. This is the measure that incorporates tie strength in the graph. The phrase “tie strength” has a limited meaning here: it refers to repeated appearance in email metadata, not verified closeness outside the archive.</w:t>
+      </w:r>
+    </w:p>
+    <w:p>
+      <w:pPr>
+        <w:pStyle w:val="BodyText"/>
+      </w:pPr>
       <w:r>
         <w:rPr>
           <w:b/>
           <w:bCs/>
         </w:rPr>
-        <w:t xml:space="preserve">weighted edge</w:t>
+        <w:t xml:space="preserve">Betweenness centrality</w:t>
       </w:r>
       <w:r>
         <w:t xml:space="preserve"> </w:t>
       </w:r>
       <w:r>
-        <w:t xml:space="preserve">is an edge with a numerical value representing repeated co-presence. A</w:t>
-      </w:r>
-      <w:r>
-        <w:t xml:space="preserve"> </w:t>
-      </w:r>
-      <w:r>
-        <w:rPr>
-          <w:b/>
-          <w:bCs/>
-        </w:rPr>
-        <w:t xml:space="preserve">centrality measure</w:t>
-      </w:r>
-      <w:r>
-        <w:t xml:space="preserve"> </w:t>
-      </w:r>
-      <w:r>
-        <w:t xml:space="preserve">is a statistic that describes how structurally important a node is in a network. A</w:t>
-      </w:r>
-      <w:r>
-        <w:t xml:space="preserve"> </w:t>
-      </w:r>
-      <w:r>
-        <w:rPr>
-          <w:b/>
-          <w:bCs/>
-        </w:rPr>
-        <w:t xml:space="preserve">broker</w:t>
-      </w:r>
-      <w:r>
-        <w:t xml:space="preserve"> </w:t>
-      </w:r>
-      <w:r>
-        <w:t xml:space="preserve">is an actor whose position connects otherwise less connected parts of the graph.</w:t>
-      </w:r>
-    </w:p>
-    <w:bookmarkStart w:id="14" w:name="network-definition-and-adjacency-matrix"/>
-    <w:p>
-      <w:pPr>
-        <w:pStyle w:val="Heading2"/>
-      </w:pPr>
-      <w:r>
-        <w:t xml:space="preserve">3.1 Network Definition and Adjacency Matrix</w:t>
-      </w:r>
-    </w:p>
-    <w:p>
-      <w:pPr>
-        <w:pStyle w:val="FirstParagraph"/>
-      </w:pPr>
-      <w:r>
-        <w:t xml:space="preserve">The network is an undirected weighted co-presence graph. It is undirected because the main edge definition does not distinguish direction. If two actors appear in the same metadata record, they are connected regardless of whether one is sender and the other is recipient, or whether both appear in recipient-related fields. This is a conservative choice for the main analysis because the goal is to describe shared participation in email records, not to infer direct message flow.</w:t>
-      </w:r>
-    </w:p>
-    <w:p>
-      <w:pPr>
-        <w:pStyle w:val="BodyText"/>
-      </w:pPr>
-      <w:r>
-        <w:t xml:space="preserve">The adjacency matrix is the formal representation of the graph. Rows and columns represent actors. Each cell contains the weight of the edge between the row actor and the column actor. A zero means that no retained repeated co-presence edge exists between those two actors. Since the graph is undirected, the matrix is symmetric: the value from actor A to actor B is the same as the value from actor B to actor A. The diagonal is zero because actors are not connected to themselves.</w:t>
-      </w:r>
-    </w:p>
-    <w:p>
-      <w:pPr>
-        <w:pStyle w:val="BodyText"/>
-      </w:pPr>
-      <w:r>
-        <w:t xml:space="preserve">The full weighted adjacency matrix is stored as:</w:t>
-      </w:r>
-    </w:p>
-    <w:p>
-      <w:pPr>
-        <w:pStyle w:val="BodyText"/>
-      </w:pPr>
-      <w:r>
-        <w:rPr>
-          <w:rStyle w:val="VerbatimChar"/>
-        </w:rPr>
-        <w:t xml:space="preserve">outputs/buss425/full_weighted_adjacency_matrix.csv</w:t>
-      </w:r>
-    </w:p>
-    <w:p>
-      <w:pPr>
-        <w:pStyle w:val="BodyText"/>
-      </w:pPr>
-      <w:r>
-        <w:t xml:space="preserve">The full matrix is 1,224 by 1,224, which is too large to display clearly in a slide or printed report. For presentation purposes, a top-15 matrix is also provided:</w:t>
-      </w:r>
-    </w:p>
-    <w:p>
-      <w:pPr>
-        <w:pStyle w:val="BodyText"/>
-      </w:pPr>
-      <w:r>
-        <w:rPr>
-          <w:rStyle w:val="VerbatimChar"/>
-        </w:rPr>
-        <w:t xml:space="preserve">docs/buss425_top15_adjacency_matrix.md</w:t>
-      </w:r>
-    </w:p>
-    <w:p>
-      <w:pPr>
-        <w:pStyle w:val="BodyText"/>
-      </w:pPr>
-      <w:r>
-        <w:t xml:space="preserve">The top-15 matrix is only a readable excerpt. The full CSV is the actual matrix used for the analysis.</w:t>
-      </w:r>
-    </w:p>
-    <w:bookmarkEnd w:id="14"/>
-    <w:bookmarkStart w:id="15" w:name="centrality-measures"/>
-    <w:p>
-      <w:pPr>
-        <w:pStyle w:val="Heading2"/>
-      </w:pPr>
-      <w:r>
-        <w:t xml:space="preserve">3.2 Centrality Measures</w:t>
-      </w:r>
-    </w:p>
-    <w:p>
-      <w:pPr>
-        <w:pStyle w:val="FirstParagraph"/>
-      </w:pPr>
-      <w:r>
-        <w:t xml:space="preserve">The analysis uses three centrality measures: degree, weighted degree, and betweenness centrality. These were chosen because they answer different versions of the centrality question.</w:t>
-      </w:r>
-    </w:p>
-    <w:p>
-      <w:pPr>
-        <w:pStyle w:val="BodyText"/>
-      </w:pPr>
-      <w:r>
-        <w:t xml:space="preserve">Degree centrality measures how many distinct actors a node is connected to. In this research, a high-degree actor appears with many different actors in the retained metadata. Degree is useful for measuring breadth of connection, but it does not distinguish between repeated and occasional co-presences.</w:t>
-      </w:r>
-    </w:p>
-    <w:p>
-      <w:pPr>
-        <w:pStyle w:val="BodyText"/>
-      </w:pPr>
-      <w:r>
-        <w:t xml:space="preserve">Weighted degree adds the weights of a node’s edges. It captures repeated co-presence intensity. This is especially important because the network should account for relationship strength. In this case, relationship strength means repeated metadata co-presence, not necessarily relationship closeness.</w:t>
-      </w:r>
-    </w:p>
-    <w:p>
-      <w:pPr>
-        <w:pStyle w:val="BodyText"/>
-      </w:pPr>
-      <w:r>
-        <w:t xml:space="preserve">Betweenness centrality measures how often a node lies on shortest paths between other nodes. It identifies actors who may serve as brokers or bridges in the graph. In a co-presence network, high betweenness suggests that an actor connects parts of the metadata network that would otherwise be farther apart. For weighted betweenness, repeated co-presence is treated as a stronger connection by using</w:t>
+        <w:t xml:space="preserve">measures how often a node lies on shortest paths between other nodes. It is useful for identifying brokers or bridge-like positions. For the weighted calculation, a stronger edge is treated as a shorter distance by using</w:t>
       </w:r>
       <w:r>
         <w:t xml:space="preserve"> </w:t>
@@ -1178,10 +1135,7 @@
         <w:t xml:space="preserve">1 / weight</w:t>
       </w:r>
       <w:r>
-        <w:t xml:space="preserve"> </w:t>
-      </w:r>
-      <w:r>
-        <w:t xml:space="preserve">as the distance. This means that frequently repeated co-presence creates shorter paths than weaker co-presence.</w:t>
+        <w:t xml:space="preserve">. A frequently recurring metadata association therefore creates a shorter path than a weak one.</w:t>
       </w:r>
     </w:p>
     <w:p>
@@ -1189,7 +1143,7 @@
         <w:pStyle w:val="BodyText"/>
       </w:pPr>
       <w:r>
-        <w:t xml:space="preserve">The three measures are complementary. A node can have high degree but low betweenness if it is broadly connected inside one dense area. Another node can have lower degree but meaningful betweenness if it links separate clusters. This distinction is central to the research question because the goal is not simply to count contacts but to understand structural roles.</w:t>
+        <w:t xml:space="preserve">Using all three measures avoids flattening different structural roles into one ranking. Degree captures range, weighted degree captures recurrence, and betweenness captures position between other nodes. High betweenness is still a property of the graph, not evidence of influence, intent, or a close real-world relationship.</w:t>
       </w:r>
     </w:p>
     <w:bookmarkEnd w:id="15"/>
@@ -1197,6 +1151,7 @@
     <w:p>
       <w:pPr>
         <w:pStyle w:val="Heading2"/>
+        <w:keepNext/>
       </w:pPr>
       <w:r>
         <w:t xml:space="preserve">3.3 Visualization and Robustness Checks</w:t>
@@ -1207,7 +1162,7 @@
         <w:pStyle w:val="FirstParagraph"/>
       </w:pPr>
       <w:r>
-        <w:t xml:space="preserve">The project includes an interactive 3D visualization of a readable subset of the graph. The visualization arranges nodes into distance shells around Jeffrey Epstein. Epstein is shown as the center node. Actors one graph step away appear in the first shell, actors two steps away in the second shell, and so on. This helps make the centralized structure easier to see.</w:t>
+        <w:t xml:space="preserve">The project includes an interactive 3D graph for exploring a readable subset of the network. Actors are arranged in distance shells around Epstein. The first shell contains nodes one graph step away, the second shell contains nodes two steps away, and so on. This view makes the core-periphery pattern easier to inspect.</w:t>
       </w:r>
     </w:p>
     <w:p>
@@ -1215,7 +1170,7 @@
         <w:pStyle w:val="BodyText"/>
       </w:pPr>
       <w:r>
-        <w:t xml:space="preserve">However, the visualization is not treated as standalone evidence. The analytical claims rely on the adjacency matrix, centrality table, and robustness checks. Visual proximity in the graph is graph-theoretic proximity only. It does not prove direct communication, real-world closeness, or shared intent.</w:t>
+        <w:t xml:space="preserve">The visual layout is a companion to the calculations, not a substitute for them. Spatial proximity means proximity in the co-presence graph. It should not be read as proof of direct communication or personal closeness.</w:t>
       </w:r>
     </w:p>
     <w:p>
@@ -1223,7 +1178,7 @@
         <w:pStyle w:val="BodyText"/>
       </w:pPr>
       <w:r>
-        <w:t xml:space="preserve">The robustness checks test whether the main conclusion depends on weak ties or on the undirected co-presence design. First, the minimum repeated co-presence threshold is increased from 2 to 100. This checks whether centralization remains when only stronger repeated ties are retained. Second, a directed sender-recipient graph is used as an alternative check. In that graph, edges go from senders to to/cc/bcc participants. This does not replace the main graph, but it tests whether the centralization result appears when direction is preserved.</w:t>
+        <w:t xml:space="preserve">Two robustness checks are used. The first raises the minimum edge threshold from 2 to 100 repeated co-presences. This tests whether the central pattern depends on weak ties. The second constructs a directed sender-recipient graph, with edges running from senders to actors listed in to, cc, or bcc fields. The directed version asks whether the broad conclusion changes when message direction is retained.</w:t>
       </w:r>
     </w:p>
     <w:bookmarkEnd w:id="16"/>
@@ -1232,6 +1187,7 @@
     <w:p>
       <w:pPr>
         <w:pStyle w:val="Heading1"/>
+        <w:keepNext/>
       </w:pPr>
       <w:r>
         <w:t xml:space="preserve">4. Results</w:t>
@@ -1241,6 +1197,7 @@
     <w:p>
       <w:pPr>
         <w:pStyle w:val="Heading2"/>
+        <w:keepNext/>
       </w:pPr>
       <w:r>
         <w:t xml:space="preserve">4.1 Descriptive Network Structure</w:t>
@@ -1251,7 +1208,7 @@
         <w:pStyle w:val="FirstParagraph"/>
       </w:pPr>
       <w:r>
-        <w:t xml:space="preserve">The filtered network contains 1,224 actors and 5,426 weighted co-presence edges. This makes the network large enough for meaningful centrality analysis. The edge threshold removes one-off co-presence, so the graph is built from repeated metadata association. The largest connected component includes most of the retained actors, which means that the graph is not just a collection of isolated fragments. Instead, the visible metadata forms a connected communication structure around a central core.</w:t>
+        <w:t xml:space="preserve">After filtering, the graph contains 1,224 actors and 5,426 weighted edges. Most retained actors belong to one large connected component. The graph is therefore not a loose collection of isolated groups. Its visible structure is organized around a dense central area with thinner paths extending outward.</w:t>
       </w:r>
     </w:p>
     <w:p>
@@ -1259,7 +1216,7 @@
         <w:pStyle w:val="BodyText"/>
       </w:pPr>
       <w:r>
-        <w:t xml:space="preserve">The network is highly centralized. This is partly expected because the archive is organized around Epstein. The important question is therefore not whether Epstein is central, but how much of the remaining structure can be explained by other intermediaries. The centrality results show that several actors occupy structurally important positions beyond the focal actor.</w:t>
+        <w:t xml:space="preserve">The network is strongly centralized around Epstein. Given the archive boundary, this is expected. The centrality rankings become more useful when they are used to identify the actors who structure the graph beyond that focal node.</w:t>
       </w:r>
     </w:p>
     <w:bookmarkEnd w:id="18"/>
@@ -1267,6 +1224,7 @@
     <w:p>
       <w:pPr>
         <w:pStyle w:val="Heading2"/>
+        <w:keepNext/>
       </w:pPr>
       <w:r>
         <w:t xml:space="preserve">4.2 Centrality Rankings</w:t>
@@ -1277,7 +1235,7 @@
         <w:pStyle w:val="FirstParagraph"/>
       </w:pPr>
       <w:r>
-        <w:t xml:space="preserve">The main centrality results are shown below.</w:t>
+        <w:t xml:space="preserve">The main rankings are shown below.</w:t>
       </w:r>
     </w:p>
     <w:p>
@@ -2620,7 +2578,7 @@
         <w:pStyle w:val="BodyText"/>
       </w:pPr>
       <w:r>
-        <w:t xml:space="preserve">Jeffrey Epstein has the highest degree, highest weighted degree, and highest betweenness centrality. His degree of 730 means that he is connected to 730 distinct actors in the retained co-presence graph. His weighted degree of 343,926 means that his ties are not only numerous but repeated many times across the metadata. His betweenness score of 0.904 means that he lies on a large share of shortest paths between other actors.</w:t>
+        <w:t xml:space="preserve">Epstein ranks first by degree, weighted degree, and betweenness. His degree of 730 means that he shares retained metadata records with 730 distinct actors. His weighted degree of 343,926 shows that many of those links recur. His betweenness score of 0.904 places him on a large share of the shortest paths in the graph.</w:t>
       </w:r>
     </w:p>
     <w:p>
@@ -2628,7 +2586,7 @@
         <w:pStyle w:val="BodyText"/>
       </w:pPr>
       <w:r>
-        <w:t xml:space="preserve">This result confirms that the graph reflects the archive boundary, but it should not be overinterpreted. Since the archive is Epstein-centered, Epstein’s dominance is not surprising. It is better understood as the baseline result. The more interesting interpretation comes from the next-ranked actors.</w:t>
+        <w:t xml:space="preserve">These values reflect the archive’s construction as much as they reflect its contents. Since the corpus is organized around Epstein’s email records, his position is best treated as the reference point for the rest of the analysis.</w:t>
       </w:r>
     </w:p>
     <w:p>
@@ -2636,7 +2594,15 @@
         <w:pStyle w:val="BodyText"/>
       </w:pPr>
       <w:r>
-        <w:t xml:space="preserve">Lesley Groff has degree 390, weighted degree 110,003, and betweenness 0.246. This combination indicates both broad reach and repeated co-presence. Richard Kahn has degree 242, weighted degree 74,112, and betweenness 0.154, also suggesting a structurally important administrative or financial position in the visible metadata. Stewart Oldfield has lower degree but still high betweenness, which points toward an intermediary position. Brad Edwards has much lower degree and weighted degree than the highest-volume actors, but his betweenness is relatively high, suggesting a bridge-like position into a legal cluster.</w:t>
+        <w:t xml:space="preserve">Lesley Groff is the clearest secondary hub, with degree 390, weighted degree 110,003, and betweenness 0.246. Richard Kahn follows with degree 242, weighted degree 74,112, and betweenness 0.154. Both combine broad reach with repeated co-presence. Stewart Oldfield has a smaller degree of 96 but a betweenness score of 0.091, which places him relatively high as an intermediary. Brad Edwards is a different case: his degree is only 24 and his weighted degree is 903, yet his betweenness score of 0.038 is the fifth highest in the table. His position is more bridge-like than high-volume.</w:t>
+      </w:r>
+    </w:p>
+    <w:p>
+      <w:pPr>
+        <w:pStyle w:val="BodyText"/>
+      </w:pPr>
+      <w:r>
+        <w:t xml:space="preserve">The same interpretive caution applies to every row. A high score describes a structural position in the released metadata. It does not establish the nature of an actor’s real-world relationship with any other person in the graph.</w:t>
       </w:r>
     </w:p>
     <w:bookmarkEnd w:id="22"/>
@@ -2644,6 +2610,7 @@
     <w:p>
       <w:pPr>
         <w:pStyle w:val="Heading2"/>
+        <w:keepNext/>
       </w:pPr>
       <w:r>
         <w:t xml:space="preserve">4.3 Intermediaries Beyond the Expected Center</w:t>
@@ -2654,7 +2621,7 @@
         <w:pStyle w:val="FirstParagraph"/>
       </w:pPr>
       <w:r>
-        <w:t xml:space="preserve">The key finding is that the second layer of central actors is not homogeneous. Different actors are central in different ways.</w:t>
+        <w:t xml:space="preserve">The actors below Epstein do not form one uniform category. Their rankings suggest several types of position.</w:t>
       </w:r>
     </w:p>
     <w:p>
@@ -2662,7 +2629,7 @@
         <w:pStyle w:val="BodyText"/>
       </w:pPr>
       <w:r>
-        <w:t xml:space="preserve">Lesley Groff and Richard Kahn appear as high-volume intermediaries. Their high weighted degree values show repeated co-presence across many retained email records. This suggests that their structural importance comes not only from the number of distinct actors connected to them, but from repeated participation in central metadata records. They are not simply present in the network; they are strongly connected through repeated weighted ties.</w:t>
+        <w:t xml:space="preserve">Lesley Groff and Richard Kahn appear as high-volume intermediaries. They have many distinct links and high weighted degree values, meaning that their connections recur across the retained metadata. Daphne Wallace also appears in this central area, although at a lower scale.</w:t>
       </w:r>
     </w:p>
     <w:p>
@@ -2670,7 +2637,7 @@
         <w:pStyle w:val="BodyText"/>
       </w:pPr>
       <w:r>
-        <w:t xml:space="preserve">Stewart Oldfield, Paul Morris, and Karyna Shuliak appear as operational connectors. Their positions indicate repeated participation in the central communication structure, although not always at the same scale as Groff or Kahn. They help show that the network is not a simple star around Epstein. Instead, there are secondary actors who structure parts of the graph.</w:t>
+        <w:t xml:space="preserve">Stewart Oldfield, Paul Morris, and Karyna Shuliak appear as operational connectors within the core. Their scores do not match the two largest secondary hubs, but they are repeatedly present in the central part of the graph.</w:t>
       </w:r>
     </w:p>
     <w:p>
@@ -2678,7 +2645,7 @@
         <w:pStyle w:val="BodyText"/>
       </w:pPr>
       <w:r>
-        <w:t xml:space="preserve">Brad Edwards, Ghislaine Maxwell, and Noam Chomsky illustrate why betweenness matters. These actors do not necessarily have the highest weighted degree, but their betweenness values make them visible as connectors between parts of the graph. Brad Edwards is especially clear because his degree is only 24, yet his betweenness is the fifth-highest in the reported table. This means he is not central because he appears with the largest number of actors. He is central because of where he sits in the network.</w:t>
+        <w:t xml:space="preserve">Brad Edwards, Ghislaine Maxwell, and Noam Chomsky are useful examples of why betweenness should be considered separately from volume. They are not among the largest nodes by weighted degree, but their positions connect areas of the graph that would otherwise be farther apart. Brad Edwards is the clearest example: his relatively small degree would make him easy to overlook in a simple contact count.</w:t>
       </w:r>
     </w:p>
     <w:p>
@@ -2686,7 +2653,7 @@
         <w:pStyle w:val="BodyText"/>
       </w:pPr>
       <w:r>
-        <w:t xml:space="preserve">This distinction is the main value of using multiple centrality measures. Degree and weighted degree identify high-volume actors. Betweenness identifies bridge positions. Together, they reveal a layered network structure:</w:t>
+        <w:t xml:space="preserve">The categories below summarize the pattern:</w:t>
       </w:r>
     </w:p>
     <w:tbl>
@@ -2794,7 +2761,7 @@
                 <w:sz w:val="17"/>
                 <w:color w:val="FFFFFF"/>
               </w:rPr>
-              <w:t xml:space="preserve">Network meaning</w:t>
+              <w:t xml:space="preserve">Network interpretation</w:t>
             </w:r>
           </w:p>
         </w:tc>
@@ -2910,7 +2877,7 @@
                 <w:sz w:val="17"/>
                 <w:color w:val="18212B"/>
               </w:rPr>
-              <w:t xml:space="preserve">Administrative/financial intermediaries</w:t>
+              <w:t xml:space="preserve">Administrative and financial intermediaries</w:t>
             </w:r>
           </w:p>
         </w:tc>
@@ -3052,7 +3019,7 @@
                 <w:sz w:val="17"/>
                 <w:color w:val="18212B"/>
               </w:rPr>
-              <w:t xml:space="preserve">Repeated participation across central records</w:t>
+              <w:t xml:space="preserve">Repeated participation in the central core</w:t>
             </w:r>
           </w:p>
         </w:tc>
@@ -3082,7 +3049,7 @@
                 <w:sz w:val="17"/>
                 <w:color w:val="18212B"/>
               </w:rPr>
-              <w:t xml:space="preserve">Bridge-like cluster connectors</w:t>
+              <w:t xml:space="preserve">Bridge-like connectors</w:t>
             </w:r>
           </w:p>
         </w:tc>
@@ -3138,7 +3105,7 @@
                 <w:sz w:val="17"/>
                 <w:color w:val="18212B"/>
               </w:rPr>
-              <w:t xml:space="preserve">Higher betweenness relative to communication volume</w:t>
+              <w:t xml:space="preserve">Higher betweenness relative to volume</w:t>
             </w:r>
           </w:p>
         </w:tc>
@@ -3149,7 +3116,7 @@
         <w:pStyle w:val="BodyText"/>
       </w:pPr>
       <w:r>
-        <w:t xml:space="preserve">This interpretation answers the research question more fully than a single centrality ranking. It shows that the network is centralized around Epstein, but also that important intermediary positions exist beyond him.</w:t>
+        <w:t xml:space="preserve">These labels are analytical shorthand for positions in the graph. They should not be treated as claims about personal closeness, shared objectives, or responsibility.</w:t>
       </w:r>
     </w:p>
     <w:bookmarkEnd w:id="23"/>
@@ -3157,6 +3124,7 @@
     <w:p>
       <w:pPr>
         <w:pStyle w:val="Heading2"/>
+        <w:keepNext/>
       </w:pPr>
       <w:r>
         <w:t xml:space="preserve">4.4 Network Visualization</w:t>
@@ -3167,7 +3135,7 @@
         <w:pStyle w:val="FirstParagraph"/>
       </w:pPr>
       <w:r>
-        <w:t xml:space="preserve">The interactive 3D visualization is used as a companion artifact. It arranges the graph into distance shells around Epstein. The gold center node represents Epstein. Green nodes are one graph step away, blue nodes are two graph steps away, purple nodes are three graph steps away, and pink nodes are four or more graph steps away.</w:t>
+        <w:t xml:space="preserve">The interactive 3D graph arranges nodes into distance shells around Epstein. The gold node at the center represents Epstein. Green nodes are one graph step away, blue nodes are two steps away, purple nodes are three steps away, and pink nodes are four or more steps away.</w:t>
       </w:r>
     </w:p>
     <w:p>
@@ -3175,7 +3143,7 @@
         <w:pStyle w:val="BodyText"/>
       </w:pPr>
       <w:r>
-        <w:t xml:space="preserve">The visualization makes two features clear. First, the graph has a strong central core. Second, many actors are connected to the broader network through a relatively small number of intermediary paths. This supports the centrality interpretation because the visual structure is consistent with the numerical rankings.</w:t>
+        <w:t xml:space="preserve">The layout makes the central core visible and shows that many peripheral actors are connected through a smaller number of paths. This is consistent with the centrality rankings. The visualization is particularly useful for seeing why a node with moderate volume can still occupy an important bridge position.</w:t>
       </w:r>
     </w:p>
     <w:p>
@@ -3183,7 +3151,7 @@
         <w:pStyle w:val="BodyText"/>
       </w:pPr>
       <w:r>
-        <w:t xml:space="preserve">However, the visualization also creates interpretive risk. Network diagrams can make actors look socially close even when the actual edge definition is much narrower. In this research, graph distance means co-presence-network distance only. A one-step connection to Epstein means that an actor appeared with Epstein in at least one retained metadata record. It does not prove that the actor had a close personal relationship with him. For this reason, the visualization should be used to illustrate structure, not to make claims beyond the data.</w:t>
+        <w:t xml:space="preserve">The graph must be read with care. A one-step connection means that an actor appeared with Epstein in at least one retained metadata record. It does not prove a close relationship or even a direct exchange between the pair. The visualization displays metadata structure, not a verified map of personal relationships.</w:t>
       </w:r>
     </w:p>
     <w:bookmarkEnd w:id="24"/>
@@ -3191,6 +3159,7 @@
     <w:p>
       <w:pPr>
         <w:pStyle w:val="Heading2"/>
+        <w:keepNext/>
       </w:pPr>
       <w:r>
         <w:t xml:space="preserve">4.5 Robustness Checks</w:t>
@@ -3201,7 +3170,7 @@
         <w:pStyle w:val="FirstParagraph"/>
       </w:pPr>
       <w:r>
-        <w:t xml:space="preserve">The first robustness check increases the minimum repeated co-presence threshold from 2 to 100. The results are:</w:t>
+        <w:t xml:space="preserve">The first robustness check raises the minimum edge weight from 2 to 100.</w:t>
       </w:r>
     </w:p>
     <w:p>
@@ -4285,7 +4254,7 @@
         <w:pStyle w:val="BodyText"/>
       </w:pPr>
       <w:r>
-        <w:t xml:space="preserve">As the threshold increases, the network becomes smaller because weaker repeated ties are removed. However, the largest connected component remains very large at every threshold, and Epstein remains the top weighted-degree actor. Again, Epstein’s persistence is expected. The more useful interpretation is that the centralized structure remains visible even when one-off and weaker co-presence ties are excluded.</w:t>
+        <w:t xml:space="preserve">The network becomes smaller as weak ties are removed, but its largest connected component remains large at every threshold. Epstein remains the top weighted-degree actor throughout. His continued dominance is unsurprising; the useful point is that the broad centralized pattern does not disappear when the graph is restricted to stronger recurring co-presences.</w:t>
       </w:r>
     </w:p>
     <w:p>
@@ -4293,7 +4262,7 @@
         <w:pStyle w:val="BodyText"/>
       </w:pPr>
       <w:r>
-        <w:t xml:space="preserve">The second robustness check uses a directed sender-recipient graph. This alternative graph has 1,028 nodes and 4,815 repeated directed ties at the same minimum edge weight of 2. Epstein is both the top weighted sender and the top weighted recipient. This suggests that the centralization result is not only produced by treating all metadata co-presence as undirected. It also appears when direction is preserved.</w:t>
+        <w:t xml:space="preserve">The second check uses a directed sender-recipient network. At the same minimum weight of 2, the directed graph contains 1,028 nodes and 4,815 repeated directed edges. Epstein is the top weighted sender and the top weighted recipient. The centralized structure is therefore not solely an artifact of converting all metadata co-presence into undirected links.</w:t>
       </w:r>
     </w:p>
     <w:p>
@@ -4301,7 +4270,7 @@
         <w:pStyle w:val="BodyText"/>
       </w:pPr>
       <w:r>
-        <w:t xml:space="preserve">Together, these checks increase confidence that the main structural finding is not only a modeling artifact. The results remain consistent when edge strength thresholds change and when a directed graph is considered. However, these checks do not remove the core interpretive limitation: all results still depend on released metadata.</w:t>
+        <w:t xml:space="preserve">These checks support a limited conclusion: the main structural pattern is stable across several reasonable graph specifications. They do not solve the underlying limitation of the archive. Every result still depends on the available released metadata.</w:t>
       </w:r>
     </w:p>
     <w:bookmarkEnd w:id="28"/>
@@ -4309,6 +4278,7 @@
     <w:p>
       <w:pPr>
         <w:pStyle w:val="Heading2"/>
+        <w:keepNext/>
       </w:pPr>
       <w:r>
         <w:t xml:space="preserve">4.6 Simplified Broker Map and Additional Result</w:t>
@@ -4319,7 +4289,7 @@
         <w:pStyle w:val="FirstParagraph"/>
       </w:pPr>
       <w:r>
-        <w:t xml:space="preserve">To make the centrality results easier to interpret, the project also includes a simplified broker map. This graph is not a separate dataset and should not be interpreted as the full network. It is a presentation view extracted from the same filtered weighted co-presence network used in the centrality analysis. The full graph has 1,224 nodes and 5,426 weighted edges, which is too large and crowded to show clearly on one page. The simplified graph therefore displays only the main interpreted actors and selected strongest or bridge-relevant ties.</w:t>
+        <w:t xml:space="preserve">The complete graph is too crowded to read on one page, so the report includes a simplified broker map. It is drawn from the same filtered weighted network and displays ten interpreted actors with selected strong or bridge-relevant ties. It is a presentation view, not a separate dataset.</w:t>
       </w:r>
     </w:p>
     <w:p>
@@ -4382,7 +4352,7 @@
         <w:pStyle w:val="BodyText"/>
       </w:pPr>
       <w:r>
-        <w:t xml:space="preserve">In this graph, node size represents weighted degree. Larger nodes appear with others more repeatedly in the retained metadata. Edge width represents repeated co-presence strength. Node color represents the interpretation category used in the report: Epstein is shown as the expected center; administrative and financial intermediaries are shown separately from operational intermediaries; and bridge-like legal, social, or intellectual cluster connectors are shown as a third category.</w:t>
+        <w:t xml:space="preserve">Node size represents weighted degree: a larger node has more repeated co-presence across its retained edges. Edge width represents repeated metadata co-presence between a pair. Colors distinguish the categories used in the interpretation: the expected center, administrative and financial intermediaries, operational intermediaries, and bridge-like connectors.</w:t>
       </w:r>
     </w:p>
     <w:p>
@@ -4390,20 +4360,7 @@
         <w:pStyle w:val="BodyText"/>
       </w:pPr>
       <w:r>
-        <w:t xml:space="preserve">The realistic additional result suggested by this simplified view is that the network has a</w:t>
-      </w:r>
-      <w:r>
-        <w:t xml:space="preserve"> </w:t>
-      </w:r>
-      <w:r>
-        <w:rPr>
-          <w:b/>
-          <w:bCs/>
-        </w:rPr>
-        <w:t xml:space="preserve">dense administrative-operational core plus several thinner bridge paths into more specialized clusters</w:t>
-      </w:r>
-      <w:r>
-        <w:t xml:space="preserve">. Lesley Groff, Richard Kahn, Daphne Wallace, Paul Morris, Stewart Oldfield, and Karyna Shuliak are visually embedded in the strongest repeated metadata co-presence ties. This supports the interpretation that these actors are not only individually central, but also part of the same core coordination environment in the released metadata.</w:t>
+        <w:t xml:space="preserve">The map suggests a dense administrative-operational core and several thinner paths leading into more specialized areas of the archive. Lesley Groff, Richard Kahn, Daphne Wallace, Paul Morris, Stewart Oldfield, and Karyna Shuliak sit inside or close to the strongest repeated ties. Their importance comes from recurring placement in the central metadata structure rather than from a single unusual link.</w:t>
       </w:r>
     </w:p>
     <w:p>
@@ -4411,7 +4368,7 @@
         <w:pStyle w:val="BodyText"/>
       </w:pPr>
       <w:r>
-        <w:t xml:space="preserve">By contrast, Brad Edwards, Ghislaine Maxwell, and Noam Chomsky appear more bridge-like in the visual extract. Their positions are less about being in the densest administrative core and more about connecting the core to more distinct peripheral areas. This is consistent with the betweenness centrality result. Brad Edwards, for example, has far lower weighted degree than Groff or Kahn, but his betweenness score is high enough to place him among the top reported brokers. The graph therefore gives a realistic visual explanation of a key centrality lesson: a person can be structurally important even without being one of the highest-volume actors.</w:t>
+        <w:t xml:space="preserve">Brad Edwards, Ghislaine Maxwell, and Noam Chomsky appear differently in the extract. Their positions are less embedded in the densest core and more bridge-like. The comparison between Brad Edwards and the high-volume hubs is especially instructive. His weighted degree is far below Groff’s or Kahn’s, but his betweenness is still high enough to place him among the reported brokers. A contact count alone would miss that distinction.</w:t>
       </w:r>
     </w:p>
     <w:p>
@@ -4419,7 +4376,7 @@
         <w:pStyle w:val="BodyText"/>
       </w:pPr>
       <w:r>
-        <w:t xml:space="preserve">This section provides the main visual result. The message should be stated carefully: the graph shows centrality and brokerage in the released email metadata, not verified relationship closeness or collaboration. The visual result supports the conclusion that the archive has a dense coordination core and several bridge-like paths into more specialized parts of the network.</w:t>
+        <w:t xml:space="preserve">The edge values in this map are counts of retained repeated co-presences. They are not counts of verified direct messages and should not be used as measures of relationship closeness. The visual is best read as a compact explanation of the centrality results.</w:t>
       </w:r>
     </w:p>
     <w:bookmarkEnd w:id="32"/>
@@ -4428,6 +4385,7 @@
     <w:p>
       <w:pPr>
         <w:pStyle w:val="Heading1"/>
+        <w:keepNext/>
       </w:pPr>
       <w:r>
         <w:t xml:space="preserve">5. Discussion</w:t>
@@ -4438,7 +4396,7 @@
         <w:pStyle w:val="FirstParagraph"/>
       </w:pPr>
       <w:r>
-        <w:t xml:space="preserve">The research question can be answered in two steps. First, the network is highly centralized around Jeffrey Epstein. This is shown by his top rank in degree, weighted degree, and betweenness centrality. Second, and more importantly, the network reveals a set of structurally important intermediaries beyond Epstein. These actors are not central in identical ways. Some have broad reach, some have repeated co-presence, and some have broker positions.</w:t>
+        <w:t xml:space="preserve">The rankings answer the research question in two parts. Epstein is the dominant node in the archive, which is consistent with the corpus boundary. Below him, the network contains a smaller set of actors who matter for different structural reasons. Groff and Kahn combine broad reach with high recurrence. Oldfield, Morris, Shuliak, and Wallace are embedded in the central area. Edwards, Maxwell, and Chomsky stand out more because of where their links sit than because of their volume.</w:t>
       </w:r>
     </w:p>
     <w:p>
@@ -4446,7 +4404,7 @@
         <w:pStyle w:val="BodyText"/>
       </w:pPr>
       <w:r>
-        <w:t xml:space="preserve">This finding is consistent with social network theory. Central actors often matter because they control or concentrate access to others, while brokers matter because they connect otherwise separated parts of a network (Freeman, 1978; Granovetter, 1973; Burt, 1992). Brokerage is especially useful because it shows why an actor with fewer direct ties can still be structurally important. Brad Edwards is an example: his degree is lower than several administrative actors, but his betweenness is high enough to make him visible as a connector.</w:t>
+        <w:t xml:space="preserve">This distinction follows the logic of centrality research. Degree captures access to many nodes, while betweenness highlights positions that connect otherwise more separated areas of a network (Freeman, 1978). Granovetter’s (1973) work on weak ties and Burt’s (1992) account of structural holes both emphasize that a bridge can matter even when it is not part of the densest cluster. In the present graph, Brad Edwards provides the clearest illustration of this point.</w:t>
       </w:r>
     </w:p>
     <w:p>
@@ -4454,7 +4412,7 @@
         <w:pStyle w:val="BodyText"/>
       </w:pPr>
       <w:r>
-        <w:t xml:space="preserve">The findings also show why weighted ties matter. If the analysis used only binary ties, it would treat a single co-presence and thousands of repeated co-presences as equivalent. Weighted degree avoids that problem by accounting for repeated metadata association. This is why Lesley Groff and Richard Kahn stand out: they are not only connected to many actors, but repeatedly appear in central metadata records.</w:t>
+        <w:t xml:space="preserve">Weighted ties also change the interpretation. A binary network would treat a pair that appears together twice in the same way as a pair that appears together thousands of times. Weighted degree preserves that difference. It is the reason Groff and Kahn stand out so clearly among the secondary actors.</w:t>
       </w:r>
     </w:p>
     <w:p>
@@ -4462,7 +4420,7 @@
         <w:pStyle w:val="BodyText"/>
       </w:pPr>
       <w:r>
-        <w:t xml:space="preserve">The research also shows why the expected result should be handled carefully. It would be misleading to present Epstein’s centrality as surprising. The archive boundary makes it likely. A stronger interpretation is that Epstein’s centrality validates the basic structure of the graph, while the second layer of central actors provides the substantive contribution. The research is therefore not only about identifying the top node. It is about using centrality measures to interpret the structure around and beyond that top node.</w:t>
+        <w:t xml:space="preserve">The archive boundary remains central to the interpretation. Epstein’s first-place ranking should not be presented as a discovery. It is partly built into the source material. The contribution of the analysis is the view it gives of the surrounding structure: a dense core, a small group of recurring intermediaries, and several nodes whose brokerage is not obvious from volume alone.</w:t>
       </w:r>
     </w:p>
     <w:p>
@@ -4470,7 +4428,7 @@
         <w:pStyle w:val="BodyText"/>
       </w:pPr>
       <w:r>
-        <w:t xml:space="preserve">From a broader perspective, the analysis shows how social network methods can help make sense of large document archives. Email metadata can reveal patterns of coordination even when the text itself is noisy or fragmented. However, the analysis also shows the limits of computational interpretation. A graph can identify structural positions, but it cannot by itself explain motives, legal responsibility, or real-world relationships.</w:t>
+        <w:t xml:space="preserve">Network analysis is useful here because it organizes a large set of metadata records into a form that can be compared and inspected. It is also limited. The graph can describe positions inside the archive, but it cannot determine motives, legal responsibility, or the character of a real-world relationship. Work on illegal and covert networks has long noted the difficulty of drawing conclusions from incomplete records (Baker &amp; Faulkner, 1993). That caution is particularly important in this case.</w:t>
       </w:r>
     </w:p>
     <w:bookmarkEnd w:id="34"/>
@@ -4478,6 +4436,7 @@
     <w:p>
       <w:pPr>
         <w:pStyle w:val="Heading1"/>
+        <w:keepNext/>
       </w:pPr>
       <w:r>
         <w:t xml:space="preserve">6. Error Analysis and Threats to Validity</w:t>
@@ -4488,7 +4447,7 @@
         <w:pStyle w:val="FirstParagraph"/>
       </w:pPr>
       <w:r>
-        <w:t xml:space="preserve">The most important threat to validity is the interpretation of co-presence edges. An edge means two actors appeared in the same email metadata record. It does not necessarily mean that they directly communicated or had a close relationship. This risk is especially high in visual network analysis because viewers may assume that spatial closeness in a graph means social closeness in real life. The report addresses this by repeating the edge definition in the abstract, methods, results, visualization interpretation, and conclusion.</w:t>
+        <w:t xml:space="preserve">The most important limitation is the meaning of an edge. Two actors are linked when they appear in the same retained email metadata record. They may have communicated directly, but the edge rule does not prove that they did. A copied recipient, a forwarded thread, or a distribution list can produce the same pairwise link. For the same reason, graph distance must not be treated as social distance in the real world.</w:t>
       </w:r>
     </w:p>
     <w:p>
@@ -4496,7 +4455,7 @@
         <w:pStyle w:val="BodyText"/>
       </w:pPr>
       <w:r>
-        <w:t xml:space="preserve">A second threat is metadata incompleteness. Unknown and redacted actor labels are removed from the main network. This makes the results more interpretable, but it can also hide meaningful structure. If redacted actors were identifiable, some centrality rankings could change. Therefore, the results should be understood as applying to the visible released metadata only.</w:t>
+        <w:t xml:space="preserve">The archive is also incomplete by definition. Unknown and redacted labels are removed from the main graph because they are not interpretable as actors. Their removal makes the tables cleaner, but it may also hide meaningful structure. If those identities were available, some rankings could change.</w:t>
       </w:r>
     </w:p>
     <w:p>
@@ -4504,7 +4463,7 @@
         <w:pStyle w:val="BodyText"/>
       </w:pPr>
       <w:r>
-        <w:t xml:space="preserve">A third threat is entity resolution. Large archives often contain multiple spellings, email addresses, aliases, or inconsistent labels for the same person. The project uses canonical person identifiers, but entity resolution is never perfect. If one actor is split across multiple identifiers, their centrality may be underestimated. If two actors are incorrectly merged, centrality may be overestimated.</w:t>
+        <w:t xml:space="preserve">Entity resolution is another source of uncertainty. A large archive can contain spelling differences, aliases, several email addresses for one person, or inconsistent labels. The project uses canonical identifiers, but no automated matching process is perfect. Splitting one person into several nodes would reduce the measured centrality of that person. Merging two people by mistake would inflate it.</w:t>
       </w:r>
     </w:p>
     <w:p>
@@ -4512,7 +4471,7 @@
         <w:pStyle w:val="BodyText"/>
       </w:pPr>
       <w:r>
-        <w:t xml:space="preserve">A fourth threat is the crowded-email cutoff. Excluding emails with more than 25 actors reduces distortion from bulk messages, but it may also remove some meaningful large-group communications. The cutoff is a modeling choice. It is justified because the research focuses on interpretable informal network structure, but it still affects the final graph.</w:t>
+        <w:t xml:space="preserve">The crowded-email cutoff is a further modeling choice. Skipping records with more than 25 actors reduces the influence of bulk messages, but it may exclude some meaningful group communication. The threshold is reasonable for an interpretable informal-network graph, yet it still shapes the result.</w:t>
       </w:r>
     </w:p>
     <w:p>
@@ -4520,7 +4479,7 @@
         <w:pStyle w:val="BodyText"/>
       </w:pPr>
       <w:r>
-        <w:t xml:space="preserve">A fifth threat is boundary specification. The network is bounded by the released Epstein email archive. This is a defensible analytical boundary, but it is not the same as the complete real-world network. A person absent from the email archive may still have been important elsewhere, and a person central in the archive may not be central in every other context.</w:t>
+        <w:t xml:space="preserve">Finally, the network is bounded by one released email archive. It cannot represent people who were important in other settings but absent from these records. Nor does a prominent position in this graph imply the same prominence in every other Epstein-related dataset.</w:t>
       </w:r>
     </w:p>
     <w:tbl>
@@ -4686,7 +4645,7 @@
                 <w:sz w:val="17"/>
                 <w:color w:val="18212B"/>
               </w:rPr>
-              <w:t xml:space="preserve">Edges may be overread as real relationships</w:t>
+              <w:t xml:space="preserve">Edges may be mistaken for direct relationships</w:t>
             </w:r>
           </w:p>
         </w:tc>
@@ -4714,7 +4673,7 @@
                 <w:sz w:val="17"/>
                 <w:color w:val="18212B"/>
               </w:rPr>
-              <w:t xml:space="preserve">Define edge semantics repeatedly and use cautious wording</w:t>
+              <w:t xml:space="preserve">Repeat the edge definition and use narrow claims</w:t>
             </w:r>
           </w:p>
         </w:tc>
@@ -4772,7 +4731,7 @@
                 <w:sz w:val="17"/>
                 <w:color w:val="18212B"/>
               </w:rPr>
-              <w:t xml:space="preserve">Hidden structure may affect centrality</w:t>
+              <w:t xml:space="preserve">Hidden identities may change centrality rankings</w:t>
             </w:r>
           </w:p>
         </w:tc>
@@ -4800,7 +4759,7 @@
                 <w:sz w:val="17"/>
                 <w:color w:val="18212B"/>
               </w:rPr>
-              <w:t xml:space="preserve">Remove placeholders from main tables and report limitation</w:t>
+              <w:t xml:space="preserve">Remove placeholders from the main graph and state the limitation</w:t>
             </w:r>
           </w:p>
         </w:tc>
@@ -4858,7 +4817,7 @@
                 <w:sz w:val="17"/>
                 <w:color w:val="18212B"/>
               </w:rPr>
-              <w:t xml:space="preserve">Actor rankings may be split or merged</w:t>
+              <w:t xml:space="preserve">One actor may be split or several actors merged</w:t>
             </w:r>
           </w:p>
         </w:tc>
@@ -4886,7 +4845,7 @@
                 <w:sz w:val="17"/>
                 <w:color w:val="18212B"/>
               </w:rPr>
-              <w:t xml:space="preserve">Use canonical person identifiers and interpret rankings cautiously</w:t>
+              <w:t xml:space="preserve">Use canonical identifiers and interpret close rankings carefully</w:t>
             </w:r>
           </w:p>
         </w:tc>
@@ -4944,7 +4903,7 @@
                 <w:sz w:val="17"/>
                 <w:color w:val="18212B"/>
               </w:rPr>
-              <w:t xml:space="preserve">Some group communications are excluded</w:t>
+              <w:t xml:space="preserve">Some meaningful group records may be omitted</w:t>
             </w:r>
           </w:p>
         </w:tc>
@@ -4972,7 +4931,7 @@
                 <w:sz w:val="17"/>
                 <w:color w:val="18212B"/>
               </w:rPr>
-              <w:t xml:space="preserve">Use cutoff to reduce bulk-message distortion and document the choice</w:t>
+              <w:t xml:space="preserve">Document the cutoff and use it to reduce bulk-message distortion</w:t>
             </w:r>
           </w:p>
         </w:tc>
@@ -5030,7 +4989,7 @@
                 <w:sz w:val="17"/>
                 <w:color w:val="18212B"/>
               </w:rPr>
-              <w:t xml:space="preserve">Results may not generalize beyond released metadata</w:t>
+              <w:t xml:space="preserve">Results may not generalize beyond the released emails</w:t>
             </w:r>
           </w:p>
         </w:tc>
@@ -5058,7 +5017,7 @@
                 <w:sz w:val="17"/>
                 <w:color w:val="18212B"/>
               </w:rPr>
-              <w:t xml:space="preserve">Frame findings as structure inside the released archive</w:t>
+              <w:t xml:space="preserve">Limit conclusions to the released metadata</w:t>
             </w:r>
           </w:p>
         </w:tc>
@@ -5069,7 +5028,7 @@
         <w:pStyle w:val="BodyText"/>
       </w:pPr>
       <w:r>
-        <w:t xml:space="preserve">These limitations do not make the analysis invalid. They define what the analysis can and cannot claim. The network is useful for describing structural centrality in the released email metadata. It is not sufficient for making claims about private relationships, legal responsibility, or hidden intent.</w:t>
+        <w:t xml:space="preserve">These limitations define the scope of the result. The graph supports claims about centrality and brokerage in the released metadata. It does not support claims about guilt, hidden intent, or the quality of personal relationships.</w:t>
       </w:r>
     </w:p>
     <w:bookmarkEnd w:id="35"/>
@@ -5077,6 +5036,7 @@
     <w:p>
       <w:pPr>
         <w:pStyle w:val="Heading1"/>
+        <w:keepNext/>
       </w:pPr>
       <w:r>
         <w:t xml:space="preserve">7. Conclusion and Next Steps</w:t>
@@ -5087,7 +5047,7 @@
         <w:pStyle w:val="FirstParagraph"/>
       </w:pPr>
       <w:r>
-        <w:t xml:space="preserve">This research shows how centrality measures can identify structurally important actors in an informal communication metadata network. The filtered Epstein email co-presence graph contains 1,224 actors and 5,426 weighted edges. Epstein is the dominant actor by degree, weighted degree, and betweenness centrality, but this result is partly expected because the archive boundary is centered on him.</w:t>
+        <w:t xml:space="preserve">The filtered co-presence graph contains 1,224 actors and 5,426 weighted edges. Epstein ranks first by degree, weighted degree, and betweenness centrality. That result fits the source material: the archive is centered on his correspondence.</w:t>
       </w:r>
     </w:p>
     <w:p>
@@ -5095,7 +5055,7 @@
         <w:pStyle w:val="BodyText"/>
       </w:pPr>
       <w:r>
-        <w:t xml:space="preserve">The more meaningful finding is the second layer of intermediaries. Lesley Groff and Richard Kahn stand out as high-volume administrative and financial intermediaries. Stewart Oldfield, Paul Morris, and Karyna Shuliak appear as operational connectors. Brad Edwards, Ghislaine Maxwell, and Noam Chomsky are visible because of their bridge-like positions. These differences show why multiple centrality measures are useful: degree, weighted degree, and betweenness each reveal a different form of structural importance.</w:t>
+        <w:t xml:space="preserve">The rankings below Epstein are more informative. Groff and Kahn are the strongest secondary hubs by both reach and repeated co-presence. Oldfield, Morris, Shuliak, and Wallace are visible inside the central coordination structure. Edwards, Maxwell, and Chomsky demonstrate why betweenness is worth measuring separately: an actor can occupy a bridge-like position without having the highest communication volume.</w:t>
       </w:r>
     </w:p>
     <w:p>
@@ -5103,7 +5063,7 @@
         <w:pStyle w:val="BodyText"/>
       </w:pPr>
       <w:r>
-        <w:t xml:space="preserve">The conclusion is therefore cautious but substantive. The archive is not only a collection of isolated email records. It has a visible network structure centered around Epstein and shaped by a small set of intermediaries. At the same time, this structure exists inside released metadata. A co-presence edge does not prove direct communication, closeness, collaboration, shared intent, or wrongdoing.</w:t>
+        <w:t xml:space="preserve">The main conclusion is deliberately narrow. The released metadata has a dense core and a small set of recurring intermediaries. A co-presence edge records shared appearance in email metadata. It does not prove direct communication, closeness, collaboration, shared intent, or wrongdoing.</w:t>
       </w:r>
     </w:p>
     <w:p>
@@ -5111,7 +5071,7 @@
         <w:pStyle w:val="BodyText"/>
       </w:pPr>
       <w:r>
-        <w:t xml:space="preserve">Future work could improve the analysis in four ways. First, entity resolution should be manually validated for all high-centrality actors. Second, centrality could be analyzed over time to test whether intermediary roles change across different periods. Third, centrality could be compared across communication functions, such as legal, financial, travel, and scheduling records. Fourth, the email co-presence network could be compared with external documents, such as court records or flight logs, to separate archive-specific structure from broader real-world relationships.</w:t>
+        <w:t xml:space="preserve">A useful next step would be a time-based analysis. Centrality scores could be calculated by year or by shorter periods to see whether the same intermediaries remain prominent throughout the archive. The graph could also be divided by communication function, such as scheduling, travel, financial, or legal records. Before either extension, the identities of high-centrality actors should be checked manually to improve entity resolution.</w:t>
       </w:r>
     </w:p>
     <w:bookmarkEnd w:id="36"/>
@@ -5119,6 +5079,7 @@
     <w:p>
       <w:pPr>
         <w:pStyle w:val="Heading1"/>
+        <w:keepNext/>
       </w:pPr>
       <w:r>
         <w:t xml:space="preserve">Appendix</w:t>
@@ -5128,6 +5089,7 @@
     <w:p>
       <w:pPr>
         <w:pStyle w:val="Heading2"/>
+        <w:keepNext/>
       </w:pPr>
       <w:r>
         <w:t xml:space="preserve">Component Checklist</w:t>
@@ -5239,7 +5201,7 @@
                 <w:sz w:val="17"/>
                 <w:color w:val="18212B"/>
               </w:rPr>
-              <w:t xml:space="preserve">1. Identify a problem or question</w:t>
+              <w:t xml:space="preserve">Identify a problem or question</w:t>
             </w:r>
           </w:p>
         </w:tc>
@@ -5297,7 +5259,7 @@
                 <w:sz w:val="17"/>
                 <w:color w:val="18212B"/>
               </w:rPr>
-              <w:t xml:space="preserve">2. Construct a relevant network</w:t>
+              <w:t xml:space="preserve">Construct a relevant network</w:t>
             </w:r>
           </w:p>
         </w:tc>
@@ -5355,7 +5317,7 @@
                 <w:sz w:val="17"/>
                 <w:color w:val="18212B"/>
               </w:rPr>
-              <w:t xml:space="preserve">3. Use appropriate network measures</w:t>
+              <w:t xml:space="preserve">Use appropriate network measures</w:t>
             </w:r>
           </w:p>
         </w:tc>
@@ -5413,7 +5375,7 @@
                 <w:sz w:val="17"/>
                 <w:color w:val="18212B"/>
               </w:rPr>
-              <w:t xml:space="preserve">4. Visualize the network</w:t>
+              <w:t xml:space="preserve">Visualize the network</w:t>
             </w:r>
           </w:p>
         </w:tc>
@@ -5471,7 +5433,7 @@
                 <w:sz w:val="17"/>
                 <w:color w:val="18212B"/>
               </w:rPr>
-              <w:t xml:space="preserve">5. Conclusion/discussion</w:t>
+              <w:t xml:space="preserve">Conclusion and discussion</w:t>
             </w:r>
           </w:p>
         </w:tc>
@@ -5569,6 +5531,7 @@
     <w:p>
       <w:pPr>
         <w:pStyle w:val="Heading2"/>
+        <w:keepNext/>
       </w:pPr>
       <w:r>
         <w:t xml:space="preserve">Key Parameters and Outputs</w:t>
@@ -6360,8 +6323,14 @@
     <w:bookmarkEnd w:id="38"/>
     <w:bookmarkStart w:id="39" w:name="responsible-use-statement"/>
     <w:p>
+      <w:r>
+        <w:br w:type="page"/>
+      </w:r>
+    </w:p>
+    <w:p>
       <w:pPr>
         <w:pStyle w:val="Heading2"/>
+        <w:keepNext/>
       </w:pPr>
       <w:r>
         <w:t xml:space="preserve">Responsible Use Statement</w:t>
@@ -6372,7 +6341,7 @@
         <w:pStyle w:val="FirstParagraph"/>
       </w:pPr>
       <w:r>
-        <w:t xml:space="preserve">Computational tools and LLMs were used to support coding, report planning, wording, and interpretation drafting. Numerical claims, tables, and figures were generated from local scripts and checked against project outputs. LLMs were not used to invent facts, assign guilt, infer private intent, or identify hidden relationships. Sensitive claims are limited to aggregate corpus and network patterns. The analysis uses explicit caveats around co-presence edges and conservative language for actor interpretation.</w:t>
+        <w:t xml:space="preserve">Computational tools and LLMs supported coding, report planning, wording, and interpretation drafting. Numerical claims, tables, and figures were generated from local scripts and checked against project outputs. The report does not use computational tools to assign guilt, infer private intent, or claim hidden relationships. Its conclusions are limited to patterns in the released metadata.</w:t>
       </w:r>
     </w:p>
     <w:bookmarkEnd w:id="39"/>
@@ -6381,6 +6350,7 @@
     <w:p>
       <w:pPr>
         <w:pStyle w:val="Heading1"/>
+        <w:keepNext/>
       </w:pPr>
       <w:r>
         <w:t xml:space="preserve">References</w:t>
@@ -6534,27 +6504,6 @@
           <w:iCs/>
         </w:rPr>
         <w:t xml:space="preserve">Proceedings of the First Conference on Email and Anti-Spam</w:t>
-      </w:r>
-      <w:r>
-        <w:t xml:space="preserve">.</w:t>
-      </w:r>
-    </w:p>
-    <w:p>
-      <w:pPr>
-        <w:pStyle w:val="BodyText"/>
-      </w:pPr>
-      <w:r>
-        <w:t xml:space="preserve">Volscho, T. (2025). Elite sex trafficking as a crime of the powerful: A comparative case study of Jeffrey Epstein and Peter Nygard’s alleged trafficking enterprises.</w:t>
-      </w:r>
-      <w:r>
-        <w:t xml:space="preserve"> </w:t>
-      </w:r>
-      <w:r>
-        <w:rPr>
-          <w:i/>
-          <w:iCs/>
-        </w:rPr>
-        <w:t xml:space="preserve">Deviant Behavior</w:t>
       </w:r>
       <w:r>
         <w:t xml:space="preserve">.</w:t>

</xml_diff>